<commit_message>
updates package following mtg with genetics team
</commit_message>
<xml_diff>
--- a/create_xml_R/data-raw/metadata/abstract.docx
+++ b/create_xml_R/data-raw/metadata/abstract.docx
@@ -3,16 +3,135 @@
 <w:document xmlns:wpc="http://schemas.microsoft.com/office/word/2010/wordprocessingCanvas" xmlns:cx="http://schemas.microsoft.com/office/drawing/2014/chartex" xmlns:cx1="http://schemas.microsoft.com/office/drawing/2015/9/8/chartex" xmlns:cx2="http://schemas.microsoft.com/office/drawing/2015/10/21/chartex" xmlns:cx3="http://schemas.microsoft.com/office/drawing/2016/5/9/chartex" xmlns:cx4="http://schemas.microsoft.com/office/drawing/2016/5/10/chartex" xmlns:cx5="http://schemas.microsoft.com/office/drawing/2016/5/11/chartex" xmlns:cx6="http://schemas.microsoft.com/office/drawing/2016/5/12/chartex" xmlns:cx7="http://schemas.microsoft.com/office/drawing/2016/5/13/chartex" xmlns:cx8="http://schemas.microsoft.com/office/drawing/2016/5/14/chartex" xmlns:mc="http://schemas.openxmlformats.org/markup-compatibility/2006" xmlns:aink="http://schemas.microsoft.com/office/drawing/2016/ink" xmlns:am3d="http://schemas.microsoft.com/office/drawing/2017/model3d" xmlns:o="urn:schemas-microsoft-com:office:office" xmlns:oel="http://schemas.microsoft.com/office/2019/extlst" xmlns:r="http://schemas.openxmlformats.org/officeDocument/2006/relationships" xmlns:m="http://schemas.openxmlformats.org/officeDocument/2006/math" xmlns:v="urn:schemas-microsoft-com:vml" xmlns:wp14="http://schemas.microsoft.com/office/word/2010/wordprocessingDrawing" xmlns:wp="http://schemas.openxmlformats.org/drawingml/2006/wordprocessingDrawing" xmlns:w10="urn:schemas-microsoft-com:office:word" xmlns:w="http://schemas.openxmlformats.org/wordprocessingml/2006/main" xmlns:w14="http://schemas.microsoft.com/office/word/2010/wordml" xmlns:w15="http://schemas.microsoft.com/office/word/2012/wordml" xmlns:w16cex="http://schemas.microsoft.com/office/word/2018/wordml/cex" xmlns:w16cid="http://schemas.microsoft.com/office/word/2016/wordml/cid" xmlns:w16="http://schemas.microsoft.com/office/word/2018/wordml" xmlns:w16du="http://schemas.microsoft.com/office/word/2023/wordml/word16du" xmlns:w16sdtdh="http://schemas.microsoft.com/office/word/2020/wordml/sdtdatahash" xmlns:w16sdtfl="http://schemas.microsoft.com/office/word/2024/wordml/sdtformatlock" xmlns:w16se="http://schemas.microsoft.com/office/word/2015/wordml/symex" xmlns:wpg="http://schemas.microsoft.com/office/word/2010/wordprocessingGroup" xmlns:wpi="http://schemas.microsoft.com/office/word/2010/wordprocessingInk" xmlns:wne="http://schemas.microsoft.com/office/word/2006/wordml" xmlns:wps="http://schemas.microsoft.com/office/word/2010/wordprocessingShape" mc:Ignorable="w14 w15 w16se w16cid w16 w16cex w16sdtdh w16sdtfl w16du wp14">
   <w:body>
     <w:p>
-      <w:r>
-        <w:t>Genetics Abstract</w:t>
+      <w:pPr>
+        <w:rPr>
+          <w:i/>
+          <w:iCs/>
+        </w:rPr>
+      </w:pPr>
+      <w:r>
+        <w:rPr>
+          <w:i/>
+          <w:iCs/>
+        </w:rPr>
+        <w:t>SR-JPE EDI Data Package Abstract</w:t>
+      </w:r>
+    </w:p>
+    <w:p>
+      <w:r>
+        <w:t xml:space="preserve">The California Central Valley </w:t>
+      </w:r>
+      <w:r>
+        <w:t xml:space="preserve">supports </w:t>
+      </w:r>
+      <w:r>
+        <w:t>four seasonal runs of Chinook salmon (</w:t>
+      </w:r>
+      <w:r>
+        <w:rPr>
+          <w:i/>
+          <w:iCs/>
+        </w:rPr>
+        <w:t>Oncorhynchus tshawytscha</w:t>
+      </w:r>
+      <w:r>
+        <w:t xml:space="preserve">): fall, late fall, spring, and winter. Spring-run Chinook have </w:t>
+      </w:r>
+      <w:r>
+        <w:t>declined substantially</w:t>
+      </w:r>
+      <w:r>
+        <w:t xml:space="preserve"> due to habitat loss and anthropogenic climate chang</w:t>
+      </w:r>
+      <w:r>
+        <w:t xml:space="preserve">e and are listed as threatened under both the California Endangered Species Act and the federal Endangered Species Act. </w:t>
+      </w:r>
+    </w:p>
+    <w:p>
+      <w:r>
+        <w:t>In 2021, the California Department of Water Resources (DWR) and i</w:t>
+      </w:r>
+      <w:r>
+        <w:t xml:space="preserve">ts </w:t>
+      </w:r>
+      <w:r>
+        <w:t xml:space="preserve">partners </w:t>
+      </w:r>
+      <w:r>
+        <w:t>launched</w:t>
+      </w:r>
+      <w:r>
+        <w:t xml:space="preserve"> the Spring-Run Juvenile Production Estimate (SRJPE)</w:t>
+      </w:r>
+      <w:r>
+        <w:t xml:space="preserve"> to meet regulatory requirements for long-term operations of the California State Water Project.</w:t>
+      </w:r>
+      <w:r>
+        <w:t xml:space="preserve"> The SRJPE estimates</w:t>
+      </w:r>
+      <w:r>
+        <w:t xml:space="preserve"> the </w:t>
+      </w:r>
+      <w:r>
+        <w:t>annual abundance</w:t>
+      </w:r>
+      <w:r>
+        <w:t xml:space="preserve"> of natural-origin spring-run </w:t>
+      </w:r>
+      <w:r>
+        <w:t>juveniles entering</w:t>
+      </w:r>
+      <w:r>
+        <w:t xml:space="preserve"> the Sacramento-San Joaquin Delta </w:t>
+      </w:r>
+      <w:r>
+        <w:t>during outmigration</w:t>
+      </w:r>
+      <w:r>
+        <w:t xml:space="preserve">. </w:t>
+      </w:r>
+    </w:p>
+    <w:p>
+      <w:r>
+        <w:t>Accurate</w:t>
+      </w:r>
+      <w:r>
+        <w:t xml:space="preserve"> run identification </w:t>
+      </w:r>
+      <w:r>
+        <w:t xml:space="preserve">is critical to </w:t>
+      </w:r>
+      <w:r>
+        <w:t>this effort</w:t>
+      </w:r>
+      <w:r>
+        <w:t xml:space="preserve"> </w:t>
+      </w:r>
+      <w:r>
+        <w:t>and is a</w:t>
+      </w:r>
+      <w:r>
+        <w:t xml:space="preserve">chieved using two genetic </w:t>
+      </w:r>
+      <w:r>
+        <w:t>approaches</w:t>
+      </w:r>
+      <w:r>
+        <w:t>: CRISPR-based SHERLOCK</w:t>
+      </w:r>
+      <w:r>
+        <w:t xml:space="preserve"> (Specific High-sensitivity Enzymatic Reporter unLOCKing)</w:t>
+      </w:r>
+      <w:r>
+        <w:t xml:space="preserve"> and genotyping-in-thousands by sequencing (GT-seq). </w:t>
+      </w:r>
+    </w:p>
+    <w:p>
+      <w:r>
+        <w:t>This EDI data package provides genetic run assignments for outmigrating juvenile Chinook salmon collected at 11 sites across the Sacramento River Basin from water years 2022–2026. Associated data include capture date, fork length, and length-at-date (LAD)–based run assignments.</w:t>
       </w:r>
     </w:p>
     <w:p/>
-    <w:p>
-      <w:r>
-        <w:t>Hold for abstract text</w:t>
-      </w:r>
-    </w:p>
     <w:sectPr>
       <w:pgSz w:w="12240" w:h="15840"/>
       <w:pgMar w:top="1440" w:right="1440" w:bottom="1440" w:left="1440" w:header="720" w:footer="720" w:gutter="0"/>
@@ -431,7 +550,7 @@
     <w:link w:val="Heading1Char"/>
     <w:uiPriority w:val="9"/>
     <w:qFormat/>
-    <w:rsid w:val="00CF01E4"/>
+    <w:rsid w:val="00632A23"/>
     <w:pPr>
       <w:keepNext/>
       <w:keepLines/>
@@ -454,7 +573,7 @@
     <w:semiHidden/>
     <w:unhideWhenUsed/>
     <w:qFormat/>
-    <w:rsid w:val="00CF01E4"/>
+    <w:rsid w:val="00632A23"/>
     <w:pPr>
       <w:keepNext/>
       <w:keepLines/>
@@ -477,7 +596,7 @@
     <w:semiHidden/>
     <w:unhideWhenUsed/>
     <w:qFormat/>
-    <w:rsid w:val="00CF01E4"/>
+    <w:rsid w:val="00632A23"/>
     <w:pPr>
       <w:keepNext/>
       <w:keepLines/>
@@ -500,7 +619,7 @@
     <w:semiHidden/>
     <w:unhideWhenUsed/>
     <w:qFormat/>
-    <w:rsid w:val="00CF01E4"/>
+    <w:rsid w:val="00632A23"/>
     <w:pPr>
       <w:keepNext/>
       <w:keepLines/>
@@ -523,7 +642,7 @@
     <w:semiHidden/>
     <w:unhideWhenUsed/>
     <w:qFormat/>
-    <w:rsid w:val="00CF01E4"/>
+    <w:rsid w:val="00632A23"/>
     <w:pPr>
       <w:keepNext/>
       <w:keepLines/>
@@ -544,7 +663,7 @@
     <w:semiHidden/>
     <w:unhideWhenUsed/>
     <w:qFormat/>
-    <w:rsid w:val="00CF01E4"/>
+    <w:rsid w:val="00632A23"/>
     <w:pPr>
       <w:keepNext/>
       <w:keepLines/>
@@ -567,7 +686,7 @@
     <w:semiHidden/>
     <w:unhideWhenUsed/>
     <w:qFormat/>
-    <w:rsid w:val="00CF01E4"/>
+    <w:rsid w:val="00632A23"/>
     <w:pPr>
       <w:keepNext/>
       <w:keepLines/>
@@ -588,7 +707,7 @@
     <w:semiHidden/>
     <w:unhideWhenUsed/>
     <w:qFormat/>
-    <w:rsid w:val="00CF01E4"/>
+    <w:rsid w:val="00632A23"/>
     <w:pPr>
       <w:keepNext/>
       <w:keepLines/>
@@ -611,7 +730,7 @@
     <w:semiHidden/>
     <w:unhideWhenUsed/>
     <w:qFormat/>
-    <w:rsid w:val="00CF01E4"/>
+    <w:rsid w:val="00632A23"/>
     <w:pPr>
       <w:keepNext/>
       <w:keepLines/>
@@ -655,7 +774,7 @@
     <w:basedOn w:val="DefaultParagraphFont"/>
     <w:link w:val="Heading1"/>
     <w:uiPriority w:val="9"/>
-    <w:rsid w:val="00CF01E4"/>
+    <w:rsid w:val="00632A23"/>
     <w:rPr>
       <w:rFonts w:asciiTheme="majorHAnsi" w:eastAsiaTheme="majorEastAsia" w:hAnsiTheme="majorHAnsi" w:cstheme="majorBidi"/>
       <w:color w:val="0F4761" w:themeColor="accent1" w:themeShade="BF"/>
@@ -669,7 +788,7 @@
     <w:link w:val="Heading2"/>
     <w:uiPriority w:val="9"/>
     <w:semiHidden/>
-    <w:rsid w:val="00CF01E4"/>
+    <w:rsid w:val="00632A23"/>
     <w:rPr>
       <w:rFonts w:asciiTheme="majorHAnsi" w:eastAsiaTheme="majorEastAsia" w:hAnsiTheme="majorHAnsi" w:cstheme="majorBidi"/>
       <w:color w:val="0F4761" w:themeColor="accent1" w:themeShade="BF"/>
@@ -683,7 +802,7 @@
     <w:link w:val="Heading3"/>
     <w:uiPriority w:val="9"/>
     <w:semiHidden/>
-    <w:rsid w:val="00CF01E4"/>
+    <w:rsid w:val="00632A23"/>
     <w:rPr>
       <w:rFonts w:eastAsiaTheme="majorEastAsia" w:cstheme="majorBidi"/>
       <w:color w:val="0F4761" w:themeColor="accent1" w:themeShade="BF"/>
@@ -697,7 +816,7 @@
     <w:link w:val="Heading4"/>
     <w:uiPriority w:val="9"/>
     <w:semiHidden/>
-    <w:rsid w:val="00CF01E4"/>
+    <w:rsid w:val="00632A23"/>
     <w:rPr>
       <w:rFonts w:eastAsiaTheme="majorEastAsia" w:cstheme="majorBidi"/>
       <w:i/>
@@ -711,7 +830,7 @@
     <w:link w:val="Heading5"/>
     <w:uiPriority w:val="9"/>
     <w:semiHidden/>
-    <w:rsid w:val="00CF01E4"/>
+    <w:rsid w:val="00632A23"/>
     <w:rPr>
       <w:rFonts w:eastAsiaTheme="majorEastAsia" w:cstheme="majorBidi"/>
       <w:color w:val="0F4761" w:themeColor="accent1" w:themeShade="BF"/>
@@ -723,7 +842,7 @@
     <w:link w:val="Heading6"/>
     <w:uiPriority w:val="9"/>
     <w:semiHidden/>
-    <w:rsid w:val="00CF01E4"/>
+    <w:rsid w:val="00632A23"/>
     <w:rPr>
       <w:rFonts w:eastAsiaTheme="majorEastAsia" w:cstheme="majorBidi"/>
       <w:i/>
@@ -737,7 +856,7 @@
     <w:link w:val="Heading7"/>
     <w:uiPriority w:val="9"/>
     <w:semiHidden/>
-    <w:rsid w:val="00CF01E4"/>
+    <w:rsid w:val="00632A23"/>
     <w:rPr>
       <w:rFonts w:eastAsiaTheme="majorEastAsia" w:cstheme="majorBidi"/>
       <w:color w:val="595959" w:themeColor="text1" w:themeTint="A6"/>
@@ -749,7 +868,7 @@
     <w:link w:val="Heading8"/>
     <w:uiPriority w:val="9"/>
     <w:semiHidden/>
-    <w:rsid w:val="00CF01E4"/>
+    <w:rsid w:val="00632A23"/>
     <w:rPr>
       <w:rFonts w:eastAsiaTheme="majorEastAsia" w:cstheme="majorBidi"/>
       <w:i/>
@@ -763,7 +882,7 @@
     <w:link w:val="Heading9"/>
     <w:uiPriority w:val="9"/>
     <w:semiHidden/>
-    <w:rsid w:val="00CF01E4"/>
+    <w:rsid w:val="00632A23"/>
     <w:rPr>
       <w:rFonts w:eastAsiaTheme="majorEastAsia" w:cstheme="majorBidi"/>
       <w:color w:val="272727" w:themeColor="text1" w:themeTint="D8"/>
@@ -776,7 +895,7 @@
     <w:link w:val="TitleChar"/>
     <w:uiPriority w:val="10"/>
     <w:qFormat/>
-    <w:rsid w:val="00CF01E4"/>
+    <w:rsid w:val="00632A23"/>
     <w:pPr>
       <w:spacing w:after="80" w:line="240" w:lineRule="auto"/>
       <w:contextualSpacing/>
@@ -794,7 +913,7 @@
     <w:basedOn w:val="DefaultParagraphFont"/>
     <w:link w:val="Title"/>
     <w:uiPriority w:val="10"/>
-    <w:rsid w:val="00CF01E4"/>
+    <w:rsid w:val="00632A23"/>
     <w:rPr>
       <w:rFonts w:asciiTheme="majorHAnsi" w:eastAsiaTheme="majorEastAsia" w:hAnsiTheme="majorHAnsi" w:cstheme="majorBidi"/>
       <w:spacing w:val="-10"/>
@@ -810,7 +929,7 @@
     <w:link w:val="SubtitleChar"/>
     <w:uiPriority w:val="11"/>
     <w:qFormat/>
-    <w:rsid w:val="00CF01E4"/>
+    <w:rsid w:val="00632A23"/>
     <w:pPr>
       <w:numPr>
         <w:ilvl w:val="1"/>
@@ -829,7 +948,7 @@
     <w:basedOn w:val="DefaultParagraphFont"/>
     <w:link w:val="Subtitle"/>
     <w:uiPriority w:val="11"/>
-    <w:rsid w:val="00CF01E4"/>
+    <w:rsid w:val="00632A23"/>
     <w:rPr>
       <w:rFonts w:eastAsiaTheme="majorEastAsia" w:cstheme="majorBidi"/>
       <w:color w:val="595959" w:themeColor="text1" w:themeTint="A6"/>
@@ -845,7 +964,7 @@
     <w:link w:val="QuoteChar"/>
     <w:uiPriority w:val="29"/>
     <w:qFormat/>
-    <w:rsid w:val="00CF01E4"/>
+    <w:rsid w:val="00632A23"/>
     <w:pPr>
       <w:spacing w:before="160"/>
       <w:jc w:val="center"/>
@@ -861,7 +980,7 @@
     <w:basedOn w:val="DefaultParagraphFont"/>
     <w:link w:val="Quote"/>
     <w:uiPriority w:val="29"/>
-    <w:rsid w:val="00CF01E4"/>
+    <w:rsid w:val="00632A23"/>
     <w:rPr>
       <w:i/>
       <w:iCs/>
@@ -873,7 +992,7 @@
     <w:basedOn w:val="Normal"/>
     <w:uiPriority w:val="34"/>
     <w:qFormat/>
-    <w:rsid w:val="00CF01E4"/>
+    <w:rsid w:val="00632A23"/>
     <w:pPr>
       <w:ind w:left="720"/>
       <w:contextualSpacing/>
@@ -884,7 +1003,7 @@
     <w:basedOn w:val="DefaultParagraphFont"/>
     <w:uiPriority w:val="21"/>
     <w:qFormat/>
-    <w:rsid w:val="00CF01E4"/>
+    <w:rsid w:val="00632A23"/>
     <w:rPr>
       <w:i/>
       <w:iCs/>
@@ -898,7 +1017,7 @@
     <w:link w:val="IntenseQuoteChar"/>
     <w:uiPriority w:val="30"/>
     <w:qFormat/>
-    <w:rsid w:val="00CF01E4"/>
+    <w:rsid w:val="00632A23"/>
     <w:pPr>
       <w:pBdr>
         <w:top w:val="single" w:sz="4" w:space="10" w:color="0F4761" w:themeColor="accent1" w:themeShade="BF"/>
@@ -919,7 +1038,7 @@
     <w:basedOn w:val="DefaultParagraphFont"/>
     <w:link w:val="IntenseQuote"/>
     <w:uiPriority w:val="30"/>
-    <w:rsid w:val="00CF01E4"/>
+    <w:rsid w:val="00632A23"/>
     <w:rPr>
       <w:i/>
       <w:iCs/>
@@ -931,7 +1050,7 @@
     <w:basedOn w:val="DefaultParagraphFont"/>
     <w:uiPriority w:val="32"/>
     <w:qFormat/>
-    <w:rsid w:val="00CF01E4"/>
+    <w:rsid w:val="00632A23"/>
     <w:rPr>
       <w:b/>
       <w:bCs/>
@@ -1041,7 +1160,7 @@
         <a:latin typeface="Aptos" panose="02110004020202020204"/>
         <a:ea typeface=""/>
         <a:cs typeface=""/>
-        <a:font script="Jpan" typeface="游ゴシック"/>
+        <a:font script="Jpan" typeface="游明朝"/>
         <a:font script="Hang" typeface="맑은 고딕"/>
         <a:font script="Hans" typeface="等线"/>
         <a:font script="Hant" typeface="新細明體"/>
@@ -1149,13 +1268,6 @@
         </a:gradFill>
       </a:fillStyleLst>
       <a:lnStyleLst>
-        <a:ln w="6350" cap="flat" cmpd="sng" algn="ctr">
-          <a:solidFill>
-            <a:schemeClr val="phClr"/>
-          </a:solidFill>
-          <a:prstDash val="solid"/>
-          <a:miter lim="800000"/>
-        </a:ln>
         <a:ln w="12700" cap="flat" cmpd="sng" algn="ctr">
           <a:solidFill>
             <a:schemeClr val="phClr"/>
@@ -1164,6 +1276,13 @@
           <a:miter lim="800000"/>
         </a:ln>
         <a:ln w="19050" cap="flat" cmpd="sng" algn="ctr">
+          <a:solidFill>
+            <a:schemeClr val="phClr"/>
+          </a:solidFill>
+          <a:prstDash val="solid"/>
+          <a:miter lim="800000"/>
+        </a:ln>
+        <a:ln w="25400" cap="flat" cmpd="sng" algn="ctr">
           <a:solidFill>
             <a:schemeClr val="phClr"/>
           </a:solidFill>
@@ -1228,11 +1347,31 @@
       </a:bgFillStyleLst>
     </a:fmtScheme>
   </a:themeElements>
-  <a:objectDefaults/>
+  <a:objectDefaults>
+    <a:lnDef>
+      <a:spPr/>
+      <a:bodyPr/>
+      <a:lstStyle/>
+      <a:style>
+        <a:lnRef idx="2">
+          <a:schemeClr val="accent1"/>
+        </a:lnRef>
+        <a:fillRef idx="0">
+          <a:schemeClr val="accent1"/>
+        </a:fillRef>
+        <a:effectRef idx="1">
+          <a:schemeClr val="accent1"/>
+        </a:effectRef>
+        <a:fontRef idx="minor">
+          <a:schemeClr val="tx1"/>
+        </a:fontRef>
+      </a:style>
+    </a:lnDef>
+  </a:objectDefaults>
   <a:extraClrSchemeLst/>
   <a:extLst>
     <a:ext uri="{05A4C25C-085E-4340-85A3-A5531E510DB2}">
-      <thm15:themeFamily xmlns:thm15="http://schemas.microsoft.com/office/thememl/2012/main" name="Office Theme" id="{62F939B6-93AF-4DB8-9C6B-D6C7DFDC589F}" vid="{4A3C46E8-61CC-4603-A589-7422A47A8E4A}"/>
+      <thm15:themeFamily xmlns:thm15="http://schemas.microsoft.com/office/thememl/2012/main" name="Office Theme" id="{2E142A2C-CD16-42D6-873A-C26D2A0506FA}" vid="{1BDDFF52-6CD6-40A5-AB3C-68EB2F1E4D0A}"/>
     </a:ext>
   </a:extLst>
 </a:theme>

</xml_diff>